<commit_message>
updated 'annotation' files from 'semana_da_anotacao'
</commit_message>
<xml_diff>
--- a/data/- ANOTAR - SEMANA DA ANOTAÇÂO -/Controle_de_anotações_2.docx
+++ b/data/- ANOTAR - SEMANA DA ANOTAÇÂO -/Controle_de_anotações_2.docx
@@ -524,7 +524,7 @@
               <w:rPr>
                 <w:rtl w:val="0"/>
               </w:rPr>
-              <w:t xml:space="preserve">100</w:t>
+              <w:t xml:space="preserve">200</w:t>
             </w:r>
           </w:p>
         </w:tc>
@@ -577,7 +577,7 @@
               <w:rPr>
                 <w:rtl w:val="0"/>
               </w:rPr>
-              <w:t xml:space="preserve">100</w:t>
+              <w:t xml:space="preserve">200</w:t>
             </w:r>
           </w:p>
         </w:tc>
@@ -1081,60 +1081,60 @@
               <w:rPr>
                 <w:rtl w:val="0"/>
               </w:rPr>
+              <w:t xml:space="preserve">200</w:t>
+            </w:r>
+          </w:p>
+        </w:tc>
+        <w:tc>
+          <w:tcPr>
+            <w:vMerge w:val="restart"/>
+            <w:shd w:fill="auto" w:val="clear"/>
+            <w:tcMar>
+              <w:top w:w="100.0" w:type="dxa"/>
+              <w:left w:w="100.0" w:type="dxa"/>
+              <w:bottom w:w="100.0" w:type="dxa"/>
+              <w:right w:w="100.0" w:type="dxa"/>
+            </w:tcMar>
+            <w:vAlign w:val="top"/>
+          </w:tcPr>
+          <w:p>
+            <w:pPr>
+              <w:widowControl w:val="0"/>
+              <w:spacing w:line="240" w:lineRule="auto"/>
+              <w:jc w:val="center"/>
+              <w:rPr/>
+            </w:pPr>
+            <w:r>
+              <w:rPr>
+                <w:rtl w:val="0"/>
+              </w:rPr>
+            </w:r>
+          </w:p>
+          <w:p>
+            <w:pPr>
+              <w:widowControl w:val="0"/>
+              <w:spacing w:line="240" w:lineRule="auto"/>
+              <w:jc w:val="center"/>
+              <w:rPr/>
+            </w:pPr>
+            <w:r>
+              <w:rPr>
+                <w:rtl w:val="0"/>
+              </w:rPr>
+            </w:r>
+          </w:p>
+          <w:p>
+            <w:pPr>
+              <w:widowControl w:val="0"/>
+              <w:spacing w:line="240" w:lineRule="auto"/>
+              <w:jc w:val="center"/>
+              <w:rPr/>
+            </w:pPr>
+            <w:r>
+              <w:rPr>
+                <w:rtl w:val="0"/>
+              </w:rPr>
               <w:t xml:space="preserve">100</w:t>
-            </w:r>
-          </w:p>
-        </w:tc>
-        <w:tc>
-          <w:tcPr>
-            <w:vMerge w:val="restart"/>
-            <w:shd w:fill="auto" w:val="clear"/>
-            <w:tcMar>
-              <w:top w:w="100.0" w:type="dxa"/>
-              <w:left w:w="100.0" w:type="dxa"/>
-              <w:bottom w:w="100.0" w:type="dxa"/>
-              <w:right w:w="100.0" w:type="dxa"/>
-            </w:tcMar>
-            <w:vAlign w:val="top"/>
-          </w:tcPr>
-          <w:p>
-            <w:pPr>
-              <w:widowControl w:val="0"/>
-              <w:spacing w:line="240" w:lineRule="auto"/>
-              <w:jc w:val="center"/>
-              <w:rPr/>
-            </w:pPr>
-            <w:r>
-              <w:rPr>
-                <w:rtl w:val="0"/>
-              </w:rPr>
-            </w:r>
-          </w:p>
-          <w:p>
-            <w:pPr>
-              <w:widowControl w:val="0"/>
-              <w:spacing w:line="240" w:lineRule="auto"/>
-              <w:jc w:val="center"/>
-              <w:rPr/>
-            </w:pPr>
-            <w:r>
-              <w:rPr>
-                <w:rtl w:val="0"/>
-              </w:rPr>
-            </w:r>
-          </w:p>
-          <w:p>
-            <w:pPr>
-              <w:widowControl w:val="0"/>
-              <w:spacing w:line="240" w:lineRule="auto"/>
-              <w:jc w:val="center"/>
-              <w:rPr/>
-            </w:pPr>
-            <w:r>
-              <w:rPr>
-                <w:rtl w:val="0"/>
-              </w:rPr>
-              <w:t xml:space="preserve">0</w:t>
             </w:r>
           </w:p>
         </w:tc>
@@ -1644,60 +1644,60 @@
               <w:rPr>
                 <w:rtl w:val="0"/>
               </w:rPr>
+              <w:t xml:space="preserve">300</w:t>
+            </w:r>
+          </w:p>
+        </w:tc>
+        <w:tc>
+          <w:tcPr>
+            <w:vMerge w:val="restart"/>
+            <w:shd w:fill="auto" w:val="clear"/>
+            <w:tcMar>
+              <w:top w:w="100.0" w:type="dxa"/>
+              <w:left w:w="100.0" w:type="dxa"/>
+              <w:bottom w:w="100.0" w:type="dxa"/>
+              <w:right w:w="100.0" w:type="dxa"/>
+            </w:tcMar>
+            <w:vAlign w:val="top"/>
+          </w:tcPr>
+          <w:p>
+            <w:pPr>
+              <w:widowControl w:val="0"/>
+              <w:spacing w:line="240" w:lineRule="auto"/>
+              <w:jc w:val="center"/>
+              <w:rPr/>
+            </w:pPr>
+            <w:r>
+              <w:rPr>
+                <w:rtl w:val="0"/>
+              </w:rPr>
+            </w:r>
+          </w:p>
+          <w:p>
+            <w:pPr>
+              <w:widowControl w:val="0"/>
+              <w:spacing w:line="240" w:lineRule="auto"/>
+              <w:jc w:val="center"/>
+              <w:rPr/>
+            </w:pPr>
+            <w:r>
+              <w:rPr>
+                <w:rtl w:val="0"/>
+              </w:rPr>
+            </w:r>
+          </w:p>
+          <w:p>
+            <w:pPr>
+              <w:widowControl w:val="0"/>
+              <w:spacing w:line="240" w:lineRule="auto"/>
+              <w:jc w:val="center"/>
+              <w:rPr/>
+            </w:pPr>
+            <w:r>
+              <w:rPr>
+                <w:rtl w:val="0"/>
+              </w:rPr>
               <w:t xml:space="preserve">100</w:t>
-            </w:r>
-          </w:p>
-        </w:tc>
-        <w:tc>
-          <w:tcPr>
-            <w:vMerge w:val="restart"/>
-            <w:shd w:fill="auto" w:val="clear"/>
-            <w:tcMar>
-              <w:top w:w="100.0" w:type="dxa"/>
-              <w:left w:w="100.0" w:type="dxa"/>
-              <w:bottom w:w="100.0" w:type="dxa"/>
-              <w:right w:w="100.0" w:type="dxa"/>
-            </w:tcMar>
-            <w:vAlign w:val="top"/>
-          </w:tcPr>
-          <w:p>
-            <w:pPr>
-              <w:widowControl w:val="0"/>
-              <w:spacing w:line="240" w:lineRule="auto"/>
-              <w:jc w:val="center"/>
-              <w:rPr/>
-            </w:pPr>
-            <w:r>
-              <w:rPr>
-                <w:rtl w:val="0"/>
-              </w:rPr>
-            </w:r>
-          </w:p>
-          <w:p>
-            <w:pPr>
-              <w:widowControl w:val="0"/>
-              <w:spacing w:line="240" w:lineRule="auto"/>
-              <w:jc w:val="center"/>
-              <w:rPr/>
-            </w:pPr>
-            <w:r>
-              <w:rPr>
-                <w:rtl w:val="0"/>
-              </w:rPr>
-            </w:r>
-          </w:p>
-          <w:p>
-            <w:pPr>
-              <w:widowControl w:val="0"/>
-              <w:spacing w:line="240" w:lineRule="auto"/>
-              <w:jc w:val="center"/>
-              <w:rPr/>
-            </w:pPr>
-            <w:r>
-              <w:rPr>
-                <w:rtl w:val="0"/>
-              </w:rPr>
-              <w:t xml:space="preserve">0</w:t>
             </w:r>
           </w:p>
         </w:tc>
@@ -2257,7 +2257,7 @@
               <w:rPr>
                 <w:rtl w:val="0"/>
               </w:rPr>
-              <w:t xml:space="preserve">0</w:t>
+              <w:t xml:space="preserve">100</w:t>
             </w:r>
           </w:p>
         </w:tc>

</xml_diff>